<commit_message>
docs: record the JWT jti hardening found by the auth integration test
Co-authored-by: arena-agent <297053741+arena-agent@users.noreply.github.com>
</commit_message>
<xml_diff>
--- a/docs/PROJECT-DOCUMENTATION.docx
+++ b/docs/PROJECT-DOCUMENTATION.docx
@@ -4528,6 +4528,44 @@
       </w:pPr>
       <w:r>
         <w:t xml:space="preserve">24 runnable check scripts guard pricing, geo coverage, settings parity, phone canonicalisation, uploads.</w:t>
+      </w:r>
+    </w:p>
+    <w:p>
+      <w:pPr>
+        <w:pStyle w:val="ListParagraph"/>
+        <w:numPr>
+          <w:ilvl w:val="0"/>
+          <w:numId w:val="1"/>
+        </w:numPr>
+        <w:spacing w:after="60"/>
+      </w:pPr>
+      <w:r>
+        <w:rPr>
+          <w:b/>
+          <w:bCs/>
+        </w:rPr>
+        <w:t xml:space="preserve">JWT `jti` (2026-09-12)</w:t>
+      </w:r>
+      <w:r>
+        <w:t xml:space="preserve">: every access/refresh token now carries a random </w:t>
+      </w:r>
+      <w:r>
+        <w:rPr>
+          <w:rFonts w:ascii="Consolas" w:cs="Consolas" w:eastAsia="Consolas" w:hAnsi="Consolas"/>
+        </w:rPr>
+        <w:t xml:space="preserve">jti</w:t>
+      </w:r>
+      <w:r>
+        <w:t xml:space="preserve"> — before, two token pairs issued for the same user within one second were byte-identical and the second </w:t>
+      </w:r>
+      <w:r>
+        <w:rPr>
+          <w:rFonts w:ascii="Consolas" w:cs="Consolas" w:eastAsia="Consolas" w:hAnsi="Consolas"/>
+        </w:rPr>
+        <w:t xml:space="preserve">refreshToken.create</w:t>
+      </w:r>
+      <w:r>
+        <w:t xml:space="preserve"> failed the UNIQUE constraint (P2002). Found by the new auth integration test; previously live in register→login-immediately and concurrent-device logins.</w:t>
       </w:r>
     </w:p>
     <w:p>

</xml_diff>

<commit_message>
docs: record the exact-equality wallet debit hardening found by the order integration suite
Co-authored-by: arena-agent <297053741+arena-agent@users.noreply.github.com>
</commit_message>
<xml_diff>
--- a/docs/PROJECT-DOCUMENTATION.docx
+++ b/docs/PROJECT-DOCUMENTATION.docx
@@ -4566,6 +4566,53 @@
       </w:r>
       <w:r>
         <w:t xml:space="preserve"> failed the UNIQUE constraint (P2002). Found by the new auth integration test; previously live in register→login-immediately and concurrent-device logins.</w:t>
+      </w:r>
+    </w:p>
+    <w:p>
+      <w:pPr>
+        <w:pStyle w:val="ListParagraph"/>
+        <w:numPr>
+          <w:ilvl w:val="0"/>
+          <w:numId w:val="1"/>
+        </w:numPr>
+        <w:spacing w:after="60"/>
+      </w:pPr>
+      <w:r>
+        <w:rPr>
+          <w:b/>
+          <w:bCs/>
+        </w:rPr>
+        <w:t xml:space="preserve">Exact-equality wallet debit (2026-09-12)</w:t>
+      </w:r>
+      <w:r>
+        <w:t xml:space="preserve">: the guarded wallet debit passed the amount as a JS double; the query engine compares it against the NUMERIC balance via the double's binary expansion, so at exact equality (</w:t>
+      </w:r>
+      <w:r>
+        <w:rPr>
+          <w:rFonts w:ascii="Consolas" w:cs="Consolas" w:eastAsia="Consolas" w:hAnsi="Consolas"/>
+        </w:rPr>
+        <w:t xml:space="preserve">balance == amount</w:t>
+      </w:r>
+      <w:r>
+        <w:t xml:space="preserve">) the epsilon made </w:t>
+      </w:r>
+      <w:r>
+        <w:rPr>
+          <w:rFonts w:ascii="Consolas" w:cs="Consolas" w:eastAsia="Consolas" w:hAnsi="Consolas"/>
+        </w:rPr>
+        <w:t xml:space="preserve">gte</w:t>
+      </w:r>
+      <w:r>
+        <w:t xml:space="preserve"> false and the debit matched zero rows. Full-wallet payment with balance exactly equal to the total was rejected ("need ₹X, have ₹X"); partial-wallet orders silently skipped the wallet debit and charged the gateway everything. Both debit sites now compare/decrement in exact </w:t>
+      </w:r>
+      <w:r>
+        <w:rPr>
+          <w:rFonts w:ascii="Consolas" w:cs="Consolas" w:eastAsia="Consolas" w:hAnsi="Consolas"/>
+        </w:rPr>
+        <w:t xml:space="preserve">Prisma.Decimal</w:t>
+      </w:r>
+      <w:r>
+        <w:t xml:space="preserve"> space. Found by the order integration suite.</w:t>
       </w:r>
     </w:p>
     <w:p>

</xml_diff>